<commit_message>
Adiciona termo de devolução de chaves e novo visual da marca
- Alternância Entrega/Devolução no campo de chaves, refletida na
  prévia, no DOCX e no PDF (título e verbo do texto)
- TEMPLATE.docx passa a usar os campos titulo e acao
- Visual com logo e cores da Casas Comigo, fontes do sistema
- Corrige o espaçamento entre legenda e campos nas seções

Co-Authored-By: Claude Sonnet 5.5 <noreply@anthropic.com>
</commit_message>
<xml_diff>
--- a/public/TEMPLATE.docx
+++ b/public/TEMPLATE.docx
@@ -47,7 +47,7 @@
           <w:bdr w:val="none" w:sz="0" w:space="0" w:color="auto" w:frame="1"/>
           <w:lang w:eastAsia="pt-BR"/>
         </w:rPr>
-        <w:t>TERMO DE ENTREGA DE CHAVES</w:t>
+        <w:t>{{ titulo }}</w:t>
       </w:r>
       <w:r>
         <w:rPr>
@@ -252,7 +252,7 @@
           <w:bdr w:val="none" w:sz="0" w:space="0" w:color="auto" w:frame="1"/>
           <w:lang w:eastAsia="pt-BR"/>
         </w:rPr>
-        <w:t xml:space="preserve">retirou as </w:t>
+        <w:t xml:space="preserve">{{ acao }} as </w:t>
       </w:r>
       <w:r>
         <w:rPr>

</xml_diff>

<commit_message>
Ajusta redação do termo e centraliza o nome na assinatura
- Texto passa a "retirou/devolveu o conjunto de chaves contendo"
- Nome do assinante centralizado sob a linha, no DOCX (alinhamento
  centralizado, sem espaços de recuo) e na prévia/PDF

Co-Authored-By: Claude Sonnet 5.5 <noreply@anthropic.com>
</commit_message>
<xml_diff>
--- a/public/TEMPLATE.docx
+++ b/public/TEMPLATE.docx
@@ -252,7 +252,7 @@
           <w:bdr w:val="none" w:sz="0" w:space="0" w:color="auto" w:frame="1"/>
           <w:lang w:eastAsia="pt-BR"/>
         </w:rPr>
-        <w:t xml:space="preserve">{{ acao }} as </w:t>
+        <w:t xml:space="preserve">{{ acao }} o </w:t>
       </w:r>
       <w:r>
         <w:rPr>
@@ -262,7 +262,7 @@
           <w:bdr w:val="none" w:sz="0" w:space="0" w:color="auto" w:frame="1"/>
           <w:lang w:eastAsia="pt-BR"/>
         </w:rPr>
-        <w:t xml:space="preserve">chaves </w:t>
+        <w:t xml:space="preserve">conjunto de chaves </w:t>
       </w:r>
       <w:r>
         <w:rPr>
@@ -272,7 +272,7 @@
           <w:bdr w:val="none" w:sz="0" w:space="0" w:color="auto" w:frame="1"/>
           <w:lang w:eastAsia="pt-BR"/>
         </w:rPr>
-        <w:t xml:space="preserve">conjunto com </w:t>
+        <w:t xml:space="preserve">contendo </w:t>
       </w:r>
       <w:proofErr w:type="gramStart"/>
       <w:r>
@@ -832,14 +832,12 @@
           <w:bdr w:val="none" w:sz="0" w:space="0" w:color="auto" w:frame="1"/>
           <w:lang w:eastAsia="pt-BR"/>
         </w:rPr>
-        <w:t xml:space="preserve">_________________________________________       </w:t>
+        <w:t xml:space="preserve">_________________________________________</w:t>
       </w:r>
     </w:p>
     <w:p>
       <w:pPr>
-        <w:tabs>
-          <w:tab w:val="left" w:pos="5505"/>
-        </w:tabs>
+        <w:jc w:val="center"/>
       </w:pPr>
       <w:r>
         <w:rPr>
@@ -848,7 +846,7 @@
           <w:sz w:val="24"/>
           <w:szCs w:val="24"/>
         </w:rPr>
-        <w:t xml:space="preserve">                                           </w:t>
+        <w:t xml:space="preserve"/>
       </w:r>
       <w:proofErr w:type="gramStart"/>
       <w:r>

</xml_diff>